<commit_message>
rearrange the folders and run over the new dataset and produce the final model 'svmFianlModel.pkl'
</commit_message>
<xml_diff>
--- a/Project2/Dataset_Report.docx
+++ b/Project2/Dataset_Report.docx
@@ -502,7 +502,7 @@
           <w:rFonts w:ascii="Times New Roman" w:hAnsi="Times New Roman" w:cs="Times New Roman"/>
           <w:sz w:val="24"/>
         </w:rPr>
-        <w:t>Images were collected under different viewing conditions to improve the diversity of the dataset. The target objects were captured at different</w:t>
+        <w:t>Images were collected under varied viewing conditions to improve the diversity of the dataset. Each target object (Stop, Speed, Blue light, Yellow light and Sheep) was captured with variation in the following:</w:t>
       </w:r>
     </w:p>
     <w:p>
@@ -523,7 +523,7 @@
           <w:rFonts w:ascii="Times New Roman" w:hAnsi="Times New Roman" w:cs="Times New Roman"/>
           <w:sz w:val="24"/>
         </w:rPr>
-        <w:t>Different robot-to-sign distances during capture</w:t>
+        <w:t>Robot-to-sign distance during capture</w:t>
       </w:r>
     </w:p>
     <w:p>
@@ -544,7 +544,7 @@
           <w:rFonts w:ascii="Times New Roman" w:hAnsi="Times New Roman" w:cs="Times New Roman"/>
           <w:sz w:val="24"/>
         </w:rPr>
-        <w:t>Horizontal positions within the camera view</w:t>
+        <w:t>Horizontal position of the object within the camera view</w:t>
       </w:r>
     </w:p>
     <w:p>
@@ -565,7 +565,7 @@
           <w:rFonts w:ascii="Times New Roman" w:hAnsi="Times New Roman" w:cs="Times New Roman"/>
           <w:sz w:val="24"/>
         </w:rPr>
-        <w:t>Different orientations</w:t>
+        <w:t>Orientation of the object relative to the robot</w:t>
       </w:r>
     </w:p>
     <w:p>
@@ -581,7 +581,7 @@
           <w:rFonts w:ascii="Times New Roman" w:hAnsi="Times New Roman" w:cs="Times New Roman"/>
           <w:sz w:val="24"/>
         </w:rPr>
-        <w:t>The Road class contains normal driving scenes including straight sections, left and right curves, and different positions of the black line in the camera view.</w:t>
+        <w:t>The Road class contains normal driving scenes including straight sections, left and right curves, and varied positions of the black line in the camera view.</w:t>
       </w:r>
     </w:p>
     <w:p>
@@ -618,14 +618,14 @@
           <w:rFonts w:ascii="Times New Roman" w:hAnsi="Times New Roman" w:cs="Times New Roman"/>
           <w:sz w:val="24"/>
         </w:rPr>
-        <w:t>M</w:t>
+        <w:t>T</w:t>
       </w:r>
       <w:r>
         <w:rPr>
           <w:rFonts w:ascii="Times New Roman" w:hAnsi="Times New Roman" w:cs="Times New Roman"/>
           <w:sz w:val="24"/>
         </w:rPr>
-        <w:t xml:space="preserve">ost of the class images were stored at </w:t>
+        <w:t xml:space="preserve">he Stop, Speed, Blue light, Yellow light and Sheep images were stored at </w:t>
       </w:r>
       <w:r>
         <w:rPr>
@@ -639,7 +639,7 @@
           <w:rFonts w:ascii="Times New Roman" w:hAnsi="Times New Roman" w:cs="Times New Roman"/>
           <w:sz w:val="24"/>
         </w:rPr>
-        <w:t xml:space="preserve"> (Stop, Speed, Blue Light, Yellow Light, and Sheep)</w:t>
+        <w:t xml:space="preserve"/>
       </w:r>
       <w:r>
         <w:rPr>

</xml_diff>